<commit_message>
camara: quita citas de capítulo numeradas en El ojo de un solo color
Ni El espejo sin profundidad ni El tiempo que no pasa citan nunca un
número de capítulo del libro mayor cuando remiten a otra parte de él
—usan "en otro capítulo" o nombran el tema sin cifra—, porque estas
piezas están pensadas para leerse de forma independiente. El ojo de un
solo color rompía esa norma en cuatro sitios ("capítulo 27", "capítulo
10", "capítulo 43"), lo que dejaba perdido a quien no conociera el
libro original. Se sustituyen por la fórmula ya usada en El diapasón
invisible: "en otro capítulo", sin número.

Co-Authored-By: Claude Sonnet 5 <noreply@anthropic.com>
Claude-Session: https://claude.ai/code/session_01SDh3ggJbPt4Gq9T1rFFUe6
</commit_message>
<xml_diff>
--- a/camara/EHI_el_ojo_de_un_solo_color.docx
+++ b/camara/EHI_el_ojo_de_un_solo_color.docx
@@ -251,7 +251,7 @@
           <w:i w:val="0"/>
           <w:sz w:val="22"/>
         </w:rPr>
-        <w:t>Una idea no es una cosa. Es una configuración de información que puede ser adoptada por múltiples horizontes a la vez, y el horizonte que la adopta no la contiene como quien guarda un objeto: se reconfigura para que la idea funcione como principio organizador, como criterio con el que evaluar cualquier información nueva. Eso ya quedó dicho en el capítulo 27 a propósito de la religión y el fanatismo. Lo que este movimiento pregunta es qué ocurre cuando la idea que organiza el horizonte no apunta hacia arriba —hacia un reservorio o un horizonte-origen— sino hacia el lado: hacia miles de horizontes desconocidos entre sí que comparten, sin haberse visto nunca, la misma configuración.</w:t>
+        <w:t>Una idea no es una cosa. Es una configuración de información que puede ser adoptada por múltiples horizontes a la vez, y el horizonte que la adopta no la contiene como quien guarda un objeto: se reconfigura para que la idea funcione como principio organizador, como criterio con el que evaluar cualquier información nueva. Eso ya quedó dicho en otro capítulo, a propósito de la religión y el fanatismo. Lo que este movimiento pregunta es qué ocurre cuando la idea que organiza el horizonte no apunta hacia arriba —hacia un reservorio o un horizonte-origen— sino hacia el lado: hacia miles de horizontes desconocidos entre sí que comparten, sin haberse visto nunca, la misma configuración.</w:t>
       </w:r>
     </w:p>
     <w:p>
@@ -293,7 +293,7 @@
           <w:i w:val="0"/>
           <w:sz w:val="22"/>
         </w:rPr>
-        <w:t>El capítulo 10 de este libro tomó prestado del diseño de software un vocabulario para distinguir tipos de vínculo, y ese vocabulario sirve aquí con una precisión que sorprende. Una asociación es la relación más básica: dos horizontes se conocen, cooperan para algo puntual, y sus ciclos de vida son autónomos —votar por un partido una vez, sin que la propia identidad dependa de ese voto, es una asociación—. Una agregación es una relación del tipo todo-parte donde las partes sobreviven a la disolución del todo: pertenecer a un partido, un sindicato, un movimiento, y seguir siendo enteramente uno mismo si esa estructura desaparece mañana. Una composición es la relación de pertenencia más fuerte: el ciclo de vida de la parte está ligado, de forma indisoluble, al ciclo de vida del todo. Cuando el horizonte colectivo se convierte en composición, la frontera entre «yo» y «nosotros» deja de ser metáfora. Si el partido pierde, algo dentro de mí pierde. Si el movimiento se disuelve, algo dentro de mí se disuelve con él. No queda un individuo con una opinión política: queda una parte que no puede sobrevivir sola a la destrucción del todo.</w:t>
+        <w:t>Otro capítulo de este libro tomó prestado del diseño de software un vocabulario para distinguir tipos de vínculo, y ese vocabulario sirve aquí con una precisión que sorprende. Una asociación es la relación más básica: dos horizontes se conocen, cooperan para algo puntual, y sus ciclos de vida son autónomos —votar por un partido una vez, sin que la propia identidad dependa de ese voto, es una asociación—. Una agregación es una relación del tipo todo-parte donde las partes sobreviven a la disolución del todo: pertenecer a un partido, un sindicato, un movimiento, y seguir siendo enteramente uno mismo si esa estructura desaparece mañana. Una composición es la relación de pertenencia más fuerte: el ciclo de vida de la parte está ligado, de forma indisoluble, al ciclo de vida del todo. Cuando el horizonte colectivo se convierte en composición, la frontera entre «yo» y «nosotros» deja de ser metáfora. Si el partido pierde, algo dentro de mí pierde. Si el movimiento se disuelve, algo dentro de mí se disuelve con él. No queda un individuo con una opinión política: queda una parte que no puede sobrevivir sola a la destrucción del todo.</w:t>
       </w:r>
     </w:p>
     <w:p>
@@ -321,7 +321,7 @@
           <w:i w:val="0"/>
           <w:sz w:val="22"/>
         </w:rPr>
-        <w:t>Esta es exactamente la arquitectura del fanatismo descrita en el capítulo 27, aplicada aquí a su forma más contagiosa. El fanático no puede dudar, porque dudar no es cuestionar una proposición: es disolver la frontera que mantiene su horizonte intacto. Y no es casual que los fanáticos de todas las ideologías —de derechas, de izquierdas, religiosas, científicas— compartan la misma violencia ante la discrepancia: no es que odien al disidente, es que el disidente emite una frecuencia que su horizonte no puede integrar sin colapsar, y el horizonte defiende su integridad con la misma ferocidad con que un cuerpo defiende su temperatura.</w:t>
+        <w:t>Esta es exactamente la arquitectura del fanatismo descrita en otro capítulo, aplicada aquí a su forma más contagiosa. El fanático no puede dudar, porque dudar no es cuestionar una proposición: es disolver la frontera que mantiene su horizonte intacto. Y no es casual que los fanáticos de todas las ideologías —de derechas, de izquierdas, religiosas, científicas— compartan la misma violencia ante la discrepancia: no es que odien al disidente, es que el disidente emite una frecuencia que su horizonte no puede integrar sin colapsar, y el horizonte defiende su integridad con la misma ferocidad con que un cuerpo defiende su temperatura.</w:t>
       </w:r>
     </w:p>
     <w:p>
@@ -349,7 +349,7 @@
           <w:i w:val="0"/>
           <w:sz w:val="22"/>
         </w:rPr>
-        <w:t>La ética, según quedó establecido en el capítulo 43, excede el vocabulario de este experimento: ningún «es» produce por sí solo un «debería», y la política es, casi por definición, el territorio donde esa brecha se cruza sin cesar. El modelo no puede decir qué visión política es correcta —no tiene herramientas para eso, y sería una impostura fingir que las tiene—. Lo que sí puede describir es la geometría, independientemente del contenido: si un horizonte colectivo integra la discrepancia o colapsa contra ella. Esa pregunta no tiene bando. Se le puede hacer a cualquier movimiento, de cualquier color, en cualquier siglo.</w:t>
+        <w:t>La ética, según quedó establecido en otro capítulo, excede el vocabulario de este experimento: ningún «es» produce por sí solo un «debería», y la política es, casi por definición, el territorio donde esa brecha se cruza sin cesar. El modelo no puede decir qué visión política es correcta —no tiene herramientas para eso, y sería una impostura fingir que las tiene—. Lo que sí puede describir es la geometría, independientemente del contenido: si un horizonte colectivo integra la discrepancia o colapsa contra ella. Esa pregunta no tiene bando. Se le puede hacer a cualquier movimiento, de cualquier color, en cualquier siglo.</w:t>
       </w:r>
     </w:p>
     <w:p>

</xml_diff>